<commit_message>
Sync pending work: webinar docs, prospecting pack updates, RAG fix
Bundles accumulated pending changes across sessions: Support IT / PII
Guard webinar guides (152-156), prospecting pack updates (SIR/SMB),
AHK_CI pack removal, RAG ingestion n8n workflow tweaks, document-rag
shared function fix, and local dev launch config.

Co-Authored-By: Claude Sonnet 5 <noreply@anthropic.com>
</commit_message>
<xml_diff>
--- a/docs/transferai-prospection/packs-entreprises-cibles-2026-07/SMB/Courrier_SMB_2026-07-07.docx
+++ b/docs/transferai-prospection/packs-entreprises-cibles-2026-07/SMB/Courrier_SMB_2026-07-07.docx
@@ -14,7 +14,7 @@
           <w:sz w:val="20"/>
           <w:szCs w:val="20"/>
         </w:rPr>
-        <w:t xml:space="preserve">Abidjan, le 7 juillet 2026</w:t>
+        <w:t xml:space="preserve">Abidjan, le 8 juillet 2026</w:t>
       </w:r>
     </w:p>
     <w:p>
@@ -62,7 +62,7 @@
         <w:spacing w:after="300"/>
       </w:pPr>
       <w:r>
-        <w:t xml:space="preserve">SMB — Société Multi-Brasseries</w:t>
+        <w:t xml:space="preserve">SMB — Société Multinationale de Bitumes</w:t>
       </w:r>
     </w:p>
     <w:p>
@@ -114,7 +114,7 @@
         <w:spacing w:after="200"/>
       </w:pPr>
       <w:r>
-        <w:t xml:space="preserve">Au-delà de ce point d'entrée technique, nous pensons qu'il existe des leviers utiles à l'échelle de la Direction Générale et de la production : lecture des KPI industriels, remontées qualité et incidents, harmonisation des procédures et standards de travail entre sites. Notre approche n'est pas de proposer une IA générique, mais un service complet : audit, priorisation, formation des dirigeants et des équipes, accompagnement de mise en pratique sur 90 jours, et gouvernance adaptée à un environnement de production.</w:t>
+        <w:t xml:space="preserve">Au-delà de ce point d'entrée technique, nous pensons qu'il existe des leviers utiles à l'échelle de la Direction Générale : suivi qualité et continuité de la production de bitume, coordination logistique avec vos marchés régionaux (Mali, Burkina Faso, Niger), et communication financière — la SMB étant une société cotée à la BRVM. Notre approche n'est pas de proposer une IA générique, mais un service complet : audit, priorisation, formation des dirigeants et des équipes, accompagnement de mise en pratique sur 90 jours, et gouvernance adaptée à un environnement industriel et à une société cotée.</w:t>
       </w:r>
     </w:p>
     <w:p>

</xml_diff>